<commit_message>
docs: corregir proveedor SMTP de Gmail a Outlook en manuales
Co-Authored-By: Claude Sonnet 4.6 <noreply@anthropic.com>
</commit_message>
<xml_diff>
--- a/docs/manuales/soporte-administrativo.docx
+++ b/docs/manuales/soporte-administrativo.docx
@@ -2288,7 +2288,7 @@
                 <w:sz w:val="20"/>
                 <w:szCs w:val="20"/>
               </w:rPr>
-              <w:t xml:space="preserve">Gmail SMTP</w:t>
+              <w:t xml:space="preserve">Outlook SMTP</w:t>
             </w:r>
           </w:p>
         </w:tc>
@@ -2822,7 +2822,7 @@
                 <w:sz w:val="20"/>
                 <w:szCs w:val="20"/>
               </w:rPr>
-              <w:t xml:space="preserve">Gmail SMTP</w:t>
+              <w:t xml:space="preserve">Outlook SMTP</w:t>
             </w:r>
           </w:p>
         </w:tc>
@@ -3516,7 +3516,7 @@
           <w:sz w:val="22"/>
           <w:szCs w:val="22"/>
         </w:rPr>
-        <w:t xml:space="preserve">Acceso a la cuenta de Gmail corporativa (gestión del App Password para SMTP)</w:t>
+        <w:t xml:space="preserve">Acceso a la cuenta de Microsoft Outlook corporativa (gestión de credenciales SMTP)</w:t>
       </w:r>
     </w:p>
     <w:p>

</xml_diff>